<commit_message>
Informe y presentación actualizados con la arquitectura de servidores MCP
</commit_message>
<xml_diff>
--- a/_entregas/IS302_Trabajo_Final_MALI_APA7.docx
+++ b/_entregas/IS302_Trabajo_Final_MALI_APA7.docx
@@ -973,7 +973,7 @@
       </w:r>
       <w:r>
         <w:tab/>
-        <w:t>21</w:t>
+        <w:t>22</w:t>
       </w:r>
     </w:p>
     <w:p>
@@ -1041,7 +1041,7 @@
       </w:r>
       <w:r>
         <w:tab/>
-        <w:t>23</w:t>
+        <w:t>24</w:t>
       </w:r>
     </w:p>
     <w:p>
@@ -4669,7 +4669,7 @@
                 <w:color w:val="000000"/>
                 <w:sz w:val="20"/>
               </w:rPr>
-              <w:t xml:space="preserve">Protocolo abierto para exponer herramientas y datos a los modelos de lenguaje (Anthropic, 2024).</w:t>
+              <w:t>Protocolo abierto para conectar los modelos de lenguaje con herramientas y datos (Model Context Protocol, 2025).</w:t>
             </w:r>
           </w:p>
         </w:tc>
@@ -4698,7 +4698,7 @@
                 <w:color w:val="000000"/>
                 <w:sz w:val="20"/>
               </w:rPr>
-              <w:t xml:space="preserve">El servidor MCP del proyecto solo publica herramientas de nivel general, separando las fuentes restringidas.</w:t>
+              <w:t>El proyecto tiene dos servidores MCP: uno general (base de conocimiento y vacantes) y uno restringido (cuentas, matrícula, pagos y auditoría); el orquestador es su cliente y los datos restringidos nunca llegan al modelo.</w:t>
             </w:r>
           </w:p>
         </w:tc>
@@ -8940,7 +8940,7 @@
           <w:color w:val="000000"/>
           <w:sz w:val="24"/>
         </w:rPr>
-        <w:t xml:space="preserve">Como plataforma equivalente a la de referencia, el prototipo se construyó con Microsoft Agent Framework (Microsoft, 2025a) y el modelo Phi-4-mini ejecutado localmente con Foundry Local (Microsoft, 2025c), de modo que las consultas y los datos de prueba no salen del equipo. Un orquestador decide cómo se atiende cada mensaje: primero aplica los controles de seguridad (manipulación y datos sensibles) y de perfil; luego responde directamente las consultas que requieren datos exactos (vacantes, matrícula, pagos y gestión de alumnos); y, para las preguntas sobre la base general, recupera los fragmentos más relevantes con BM25 para que el modelo redacte la respuesta con su fuente. Si los fragmentos no cubren la pregunta, el asistente lo reconoce y orienta al canal oficial. La Tabla 7 relaciona cada componente del diseño con su implementación.</w:t>
+        <w:t>Como plataforma equivalente a la de referencia, el prototipo se construyó con Microsoft Agent Framework (Microsoft, 2025a) y el modelo Phi-4-mini ejecutado localmente con Foundry Local (Microsoft, 2025c), de modo que las consultas y los datos de prueba no salen del equipo. Un orquestador decide cómo se atiende cada mensaje: primero aplica los controles de seguridad (manipulación y datos sensibles) y de perfil; luego obtiene los datos exactos (vacantes, matrícula, pagos y gestión de alumnos) como cliente de dos servidores MCP propios, uno general y otro restringido, y los entrega sin pasar por el modelo; y, para las preguntas sobre la base general, recupera los fragmentos más relevantes con BM25 para que el modelo redacte la respuesta con su fuente. Si los fragmentos no cubren la pregunta, el asistente lo reconoce y orienta al canal oficial. La Tabla 7 relaciona cada componente del diseño con su implementación.</w:t>
       </w:r>
     </w:p>
     <w:p>
@@ -9538,7 +9538,7 @@
                 <w:color w:val="000000"/>
                 <w:sz w:val="20"/>
               </w:rPr>
-              <w:t xml:space="preserve">matricula.py, datos/pagos_demo.csv</w:t>
+              <w:t>matricula.py, datos_restringidos.py, datos/pagos_demo.csv</w:t>
             </w:r>
           </w:p>
         </w:tc>
@@ -9724,7 +9724,7 @@
                 <w:color w:val="000000"/>
                 <w:sz w:val="20"/>
               </w:rPr>
-              <w:t xml:space="preserve">restringido/alumnos_sinteticos.csv, restringido/matricula.csv</w:t>
+              <w:t>datos_restringidos.py, restringido/alumnos_sinteticos.csv, restringido/matricula.csv</w:t>
             </w:r>
           </w:p>
         </w:tc>
@@ -9852,7 +9852,7 @@
                 <w:color w:val="000000"/>
                 <w:sz w:val="20"/>
               </w:rPr>
-              <w:t xml:space="preserve">Herramientas MCP</w:t>
+              <w:t>Servidores MCP</w:t>
             </w:r>
           </w:p>
         </w:tc>
@@ -9881,7 +9881,7 @@
                 <w:color w:val="000000"/>
                 <w:sz w:val="20"/>
               </w:rPr>
-              <w:t xml:space="preserve">buscar_informacion_mali y consultar_vacantes (solo nivel general).</w:t>
+              <w:t>General: buscar_informacion, documento_de_curso, listar_horarios y consultar_vacantes. Restringido: cuentas, matrícula, pagos, estado, gestión de alumnos y auditoría. El orquestador es su cliente.</w:t>
             </w:r>
           </w:p>
         </w:tc>
@@ -9910,7 +9910,7 @@
                 <w:color w:val="000000"/>
                 <w:sz w:val="20"/>
               </w:rPr>
-              <w:t xml:space="preserve">mali_mcp_server.py</w:t>
+              <w:t>servidor_general.py, servidor_restringido.py, cliente_mcp.py</w:t>
             </w:r>
           </w:p>
         </w:tc>
@@ -17557,7 +17557,7 @@
           <w:color w:val="000000"/>
           <w:sz w:val="24"/>
         </w:rPr>
-        <w:t xml:space="preserve"> Phi-4-mini en Foundry Local y un servidor MCP que solo expone información general.</w:t>
+        <w:t xml:space="preserve"> Phi-4-mini en Foundry Local y dos servidores MCP que separan la información general de la restringida.</w:t>
       </w:r>
     </w:p>
     <w:p>
@@ -17840,7 +17840,7 @@
           <w:color w:val="000000"/>
           <w:sz w:val="24"/>
         </w:rPr>
-        <w:t xml:space="preserve">Anthropic. (2024, 25 de noviembre). </w:t>
+        <w:t xml:space="preserve">Campus Technology. (2017, 7 de marzo). </w:t>
       </w:r>
       <w:r>
         <w:rPr>
@@ -17850,15 +17850,15 @@
           <w:iCs/>
           <w:sz w:val="24"/>
         </w:rPr>
-        <w:t xml:space="preserve">Introducing the Model Context Protocol</w:t>
-      </w:r>
-      <w:r>
-        <w:rPr>
-          <w:rFonts w:ascii="Times New Roman" w:hAnsi="Times New Roman"/>
-          <w:color w:val="000000"/>
-          <w:sz w:val="24"/>
-        </w:rPr>
-        <w:t xml:space="preserve">. https://www.anthropic.com/news/model-context-protocol</w:t>
+        <w:t xml:space="preserve">Using AI chatbots to freeze “summer melt” in higher ed</w:t>
+      </w:r>
+      <w:r>
+        <w:rPr>
+          <w:rFonts w:ascii="Times New Roman" w:hAnsi="Times New Roman"/>
+          <w:color w:val="000000"/>
+          <w:sz w:val="24"/>
+        </w:rPr>
+        <w:t xml:space="preserve">. https://campustechnology.com/Articles/2017/03/07/Using-AI-Chatbots-to-Freeze-Summer-Melt-in-Higher-Ed.aspx</w:t>
       </w:r>
     </w:p>
     <w:p>
@@ -17873,7 +17873,7 @@
           <w:color w:val="000000"/>
           <w:sz w:val="24"/>
         </w:rPr>
-        <w:t xml:space="preserve">Campus Technology. (2017, 7 de marzo). </w:t>
+        <w:t xml:space="preserve">Decreto Supremo N.º 016-2024-JUS. (2024, 30 de noviembre). </w:t>
       </w:r>
       <w:r>
         <w:rPr>
@@ -17883,15 +17883,15 @@
           <w:iCs/>
           <w:sz w:val="24"/>
         </w:rPr>
-        <w:t xml:space="preserve">Using AI chatbots to freeze “summer melt” in higher ed</w:t>
-      </w:r>
-      <w:r>
-        <w:rPr>
-          <w:rFonts w:ascii="Times New Roman" w:hAnsi="Times New Roman"/>
-          <w:color w:val="000000"/>
-          <w:sz w:val="24"/>
-        </w:rPr>
-        <w:t xml:space="preserve">. https://campustechnology.com/Articles/2017/03/07/Using-AI-Chatbots-to-Freeze-Summer-Melt-in-Higher-Ed.aspx</w:t>
+        <w:t xml:space="preserve">Decreto Supremo que aprueba el Reglamento de la Ley N.º 29733, Ley de Protección de Datos Personales</w:t>
+      </w:r>
+      <w:r>
+        <w:rPr>
+          <w:rFonts w:ascii="Times New Roman" w:hAnsi="Times New Roman"/>
+          <w:color w:val="000000"/>
+          <w:sz w:val="24"/>
+        </w:rPr>
+        <w:t xml:space="preserve">. Ministerio de Justicia y Derechos Humanos del Perú.</w:t>
       </w:r>
     </w:p>
     <w:p>
@@ -17906,7 +17906,7 @@
           <w:color w:val="000000"/>
           <w:sz w:val="24"/>
         </w:rPr>
-        <w:t xml:space="preserve">Decreto Supremo N.º 016-2024-JUS. (2024, 30 de noviembre). </w:t>
+        <w:t xml:space="preserve">Ferraiolo, D. F., y Kuhn, D. R. (1992). Role-based access controls. En </w:t>
       </w:r>
       <w:r>
         <w:rPr>
@@ -17916,15 +17916,15 @@
           <w:iCs/>
           <w:sz w:val="24"/>
         </w:rPr>
-        <w:t xml:space="preserve">Decreto Supremo que aprueba el Reglamento de la Ley N.º 29733, Ley de Protección de Datos Personales</w:t>
-      </w:r>
-      <w:r>
-        <w:rPr>
-          <w:rFonts w:ascii="Times New Roman" w:hAnsi="Times New Roman"/>
-          <w:color w:val="000000"/>
-          <w:sz w:val="24"/>
-        </w:rPr>
-        <w:t xml:space="preserve">. Ministerio de Justicia y Derechos Humanos del Perú.</w:t>
+        <w:t xml:space="preserve">Proceedings of the 15th National Computer Security Conference</w:t>
+      </w:r>
+      <w:r>
+        <w:rPr>
+          <w:rFonts w:ascii="Times New Roman" w:hAnsi="Times New Roman"/>
+          <w:color w:val="000000"/>
+          <w:sz w:val="24"/>
+        </w:rPr>
+        <w:t xml:space="preserve"> (pp. 554–563). NIST.</w:t>
       </w:r>
     </w:p>
     <w:p>
@@ -17939,7 +17939,7 @@
           <w:color w:val="000000"/>
           <w:sz w:val="24"/>
         </w:rPr>
-        <w:t xml:space="preserve">Ferraiolo, D. F., y Kuhn, D. R. (1992). Role-based access controls. En </w:t>
+        <w:t xml:space="preserve">Gao, Y., Xiong, Y., Gao, X., Jia, K., Pan, J., Bi, Y., Dai, Y., Sun, J., Wang, M., y Wang, H. (2023). </w:t>
       </w:r>
       <w:r>
         <w:rPr>
@@ -17949,15 +17949,15 @@
           <w:iCs/>
           <w:sz w:val="24"/>
         </w:rPr>
-        <w:t xml:space="preserve">Proceedings of the 15th National Computer Security Conference</w:t>
-      </w:r>
-      <w:r>
-        <w:rPr>
-          <w:rFonts w:ascii="Times New Roman" w:hAnsi="Times New Roman"/>
-          <w:color w:val="000000"/>
-          <w:sz w:val="24"/>
-        </w:rPr>
-        <w:t xml:space="preserve"> (pp. 554–563). NIST.</w:t>
+        <w:t xml:space="preserve">Retrieval-augmented generation for large language models: A survey</w:t>
+      </w:r>
+      <w:r>
+        <w:rPr>
+          <w:rFonts w:ascii="Times New Roman" w:hAnsi="Times New Roman"/>
+          <w:color w:val="000000"/>
+          <w:sz w:val="24"/>
+        </w:rPr>
+        <w:t xml:space="preserve">. arXiv. https://arxiv.org/abs/2312.10997</w:t>
       </w:r>
     </w:p>
     <w:p>
@@ -17972,7 +17972,7 @@
           <w:color w:val="000000"/>
           <w:sz w:val="24"/>
         </w:rPr>
-        <w:t xml:space="preserve">Gao, Y., Xiong, Y., Gao, X., Jia, K., Pan, J., Bi, Y., Dai, Y., Sun, J., Wang, M., y Wang, H. (2023). </w:t>
+        <w:t xml:space="preserve">Greshake, K., Abdelnabi, S., Mishra, S., Endres, C., Holz, T., y Fritz, M. (2023). Not what you've signed up for: Compromising real-world LLM-integrated applications with indirect prompt injection. En </w:t>
       </w:r>
       <w:r>
         <w:rPr>
@@ -17982,15 +17982,15 @@
           <w:iCs/>
           <w:sz w:val="24"/>
         </w:rPr>
-        <w:t xml:space="preserve">Retrieval-augmented generation for large language models: A survey</w:t>
-      </w:r>
-      <w:r>
-        <w:rPr>
-          <w:rFonts w:ascii="Times New Roman" w:hAnsi="Times New Roman"/>
-          <w:color w:val="000000"/>
-          <w:sz w:val="24"/>
-        </w:rPr>
-        <w:t xml:space="preserve">. arXiv. https://arxiv.org/abs/2312.10997</w:t>
+        <w:t xml:space="preserve">Proceedings of the 16th ACM Workshop on Artificial Intelligence and Security</w:t>
+      </w:r>
+      <w:r>
+        <w:rPr>
+          <w:rFonts w:ascii="Times New Roman" w:hAnsi="Times New Roman"/>
+          <w:color w:val="000000"/>
+          <w:sz w:val="24"/>
+        </w:rPr>
+        <w:t xml:space="preserve"> (pp. 79–90). ACM.</w:t>
       </w:r>
     </w:p>
     <w:p>
@@ -18005,7 +18005,7 @@
           <w:color w:val="000000"/>
           <w:sz w:val="24"/>
         </w:rPr>
-        <w:t xml:space="preserve">Greshake, K., Abdelnabi, S., Mishra, S., Endres, C., Holz, T., y Fritz, M. (2023). Not what you've signed up for: Compromising real-world LLM-integrated applications with indirect prompt injection. En </w:t>
+        <w:t xml:space="preserve">IBM. (2025). </w:t>
       </w:r>
       <w:r>
         <w:rPr>
@@ -18015,15 +18015,15 @@
           <w:iCs/>
           <w:sz w:val="24"/>
         </w:rPr>
-        <w:t xml:space="preserve">Proceedings of the 16th ACM Workshop on Artificial Intelligence and Security</w:t>
-      </w:r>
-      <w:r>
-        <w:rPr>
-          <w:rFonts w:ascii="Times New Roman" w:hAnsi="Times New Roman"/>
-          <w:color w:val="000000"/>
-          <w:sz w:val="24"/>
-        </w:rPr>
-        <w:t xml:space="preserve"> (pp. 79–90). ACM.</w:t>
+        <w:t xml:space="preserve">Cost of a data breach report 2025</w:t>
+      </w:r>
+      <w:r>
+        <w:rPr>
+          <w:rFonts w:ascii="Times New Roman" w:hAnsi="Times New Roman"/>
+          <w:color w:val="000000"/>
+          <w:sz w:val="24"/>
+        </w:rPr>
+        <w:t xml:space="preserve">. IBM Security y Ponemon Institute. https://www.ibm.com/reports/data-breach</w:t>
       </w:r>
     </w:p>
     <w:p>
@@ -18038,7 +18038,7 @@
           <w:color w:val="000000"/>
           <w:sz w:val="24"/>
         </w:rPr>
-        <w:t xml:space="preserve">IBM. (2025). </w:t>
+        <w:t xml:space="preserve">Infomercado. (2025). </w:t>
       </w:r>
       <w:r>
         <w:rPr>
@@ -18048,15 +18048,15 @@
           <w:iCs/>
           <w:sz w:val="24"/>
         </w:rPr>
-        <w:t xml:space="preserve">Cost of a data breach report 2025</w:t>
-      </w:r>
-      <w:r>
-        <w:rPr>
-          <w:rFonts w:ascii="Times New Roman" w:hAnsi="Times New Roman"/>
-          <w:color w:val="000000"/>
-          <w:sz w:val="24"/>
-        </w:rPr>
-        <w:t xml:space="preserve">. IBM Security y Ponemon Institute. https://www.ibm.com/reports/data-breach</w:t>
+        <w:t xml:space="preserve">Protección de datos personales en Perú: ¿Qué deben saber las empresas para evitar sanciones?</w:t>
+      </w:r>
+      <w:r>
+        <w:rPr>
+          <w:rFonts w:ascii="Times New Roman" w:hAnsi="Times New Roman"/>
+          <w:color w:val="000000"/>
+          <w:sz w:val="24"/>
+        </w:rPr>
+        <w:t xml:space="preserve"> https://infomercado.pe/proteccion-de-datos-personales-en-peru-que-deben-saber-las-empresas-para-evitar-sanciones/</w:t>
       </w:r>
     </w:p>
     <w:p>
@@ -18071,7 +18071,7 @@
           <w:color w:val="000000"/>
           <w:sz w:val="24"/>
         </w:rPr>
-        <w:t xml:space="preserve">Infomercado. (2025). </w:t>
+        <w:t xml:space="preserve">Ji, Z., Lee, N., Frieske, R., Yu, T., Su, D., Xu, Y., Ishii, E., Bang, Y. J., Madotto, A., y Fung, P. (2023). Survey of hallucination in natural language generation. </w:t>
       </w:r>
       <w:r>
         <w:rPr>
@@ -18081,15 +18081,15 @@
           <w:iCs/>
           <w:sz w:val="24"/>
         </w:rPr>
-        <w:t xml:space="preserve">Protección de datos personales en Perú: ¿Qué deben saber las empresas para evitar sanciones?</w:t>
-      </w:r>
-      <w:r>
-        <w:rPr>
-          <w:rFonts w:ascii="Times New Roman" w:hAnsi="Times New Roman"/>
-          <w:color w:val="000000"/>
-          <w:sz w:val="24"/>
-        </w:rPr>
-        <w:t xml:space="preserve"> https://infomercado.pe/proteccion-de-datos-personales-en-peru-que-deben-saber-las-empresas-para-evitar-sanciones/</w:t>
+        <w:t xml:space="preserve">ACM Computing Surveys, 55</w:t>
+      </w:r>
+      <w:r>
+        <w:rPr>
+          <w:rFonts w:ascii="Times New Roman" w:hAnsi="Times New Roman"/>
+          <w:color w:val="000000"/>
+          <w:sz w:val="24"/>
+        </w:rPr>
+        <w:t xml:space="preserve">(12), 1–38. https://doi.org/10.1145/3571730</w:t>
       </w:r>
     </w:p>
     <w:p>
@@ -18104,7 +18104,7 @@
           <w:color w:val="000000"/>
           <w:sz w:val="24"/>
         </w:rPr>
-        <w:t xml:space="preserve">Ji, Z., Lee, N., Frieske, R., Yu, T., Su, D., Xu, Y., Ishii, E., Bang, Y. J., Madotto, A., y Fung, P. (2023). Survey of hallucination in natural language generation. </w:t>
+        <w:t xml:space="preserve">La Cámara. (2025). </w:t>
       </w:r>
       <w:r>
         <w:rPr>
@@ -18114,15 +18114,15 @@
           <w:iCs/>
           <w:sz w:val="24"/>
         </w:rPr>
-        <w:t xml:space="preserve">ACM Computing Surveys, 55</w:t>
-      </w:r>
-      <w:r>
-        <w:rPr>
-          <w:rFonts w:ascii="Times New Roman" w:hAnsi="Times New Roman"/>
-          <w:color w:val="000000"/>
-          <w:sz w:val="24"/>
-        </w:rPr>
-        <w:t xml:space="preserve">(12), 1–38. https://doi.org/10.1145/3571730</w:t>
+        <w:t xml:space="preserve">Empresas podrían recibir multas por no designar a un Oficial de Protección de Datos antes del 30 de noviembre</w:t>
+      </w:r>
+      <w:r>
+        <w:rPr>
+          <w:rFonts w:ascii="Times New Roman" w:hAnsi="Times New Roman"/>
+          <w:color w:val="000000"/>
+          <w:sz w:val="24"/>
+        </w:rPr>
+        <w:t xml:space="preserve">. https://lacamara.pe/?p=66595</w:t>
       </w:r>
     </w:p>
     <w:p>
@@ -18137,7 +18137,7 @@
           <w:color w:val="000000"/>
           <w:sz w:val="24"/>
         </w:rPr>
-        <w:t xml:space="preserve">La Cámara. (2025). </w:t>
+        <w:t xml:space="preserve">Lewis, P., Perez, E., Piktus, A., Petroni, F., Karpukhin, V., Goyal, N., … Kiela, D. (2020). Retrieval-augmented generation for knowledge-intensive NLP tasks. </w:t>
       </w:r>
       <w:r>
         <w:rPr>
@@ -18147,15 +18147,15 @@
           <w:iCs/>
           <w:sz w:val="24"/>
         </w:rPr>
-        <w:t xml:space="preserve">Empresas podrían recibir multas por no designar a un Oficial de Protección de Datos antes del 30 de noviembre</w:t>
-      </w:r>
-      <w:r>
-        <w:rPr>
-          <w:rFonts w:ascii="Times New Roman" w:hAnsi="Times New Roman"/>
-          <w:color w:val="000000"/>
-          <w:sz w:val="24"/>
-        </w:rPr>
-        <w:t xml:space="preserve">. https://lacamara.pe/?p=66595</w:t>
+        <w:t xml:space="preserve">Advances in Neural Information Processing Systems, 33</w:t>
+      </w:r>
+      <w:r>
+        <w:rPr>
+          <w:rFonts w:ascii="Times New Roman" w:hAnsi="Times New Roman"/>
+          <w:color w:val="000000"/>
+          <w:sz w:val="24"/>
+        </w:rPr>
+        <w:t xml:space="preserve">, 9459–9474.</w:t>
       </w:r>
     </w:p>
     <w:p>
@@ -18170,7 +18170,7 @@
           <w:color w:val="000000"/>
           <w:sz w:val="24"/>
         </w:rPr>
-        <w:t xml:space="preserve">Lewis, P., Perez, E., Piktus, A., Petroni, F., Karpukhin, V., Goyal, N., … Kiela, D. (2020). Retrieval-augmented generation for knowledge-intensive NLP tasks. </w:t>
+        <w:t xml:space="preserve">Ley N.º 29733. (2011). </w:t>
       </w:r>
       <w:r>
         <w:rPr>
@@ -18180,15 +18180,15 @@
           <w:iCs/>
           <w:sz w:val="24"/>
         </w:rPr>
-        <w:t xml:space="preserve">Advances in Neural Information Processing Systems, 33</w:t>
-      </w:r>
-      <w:r>
-        <w:rPr>
-          <w:rFonts w:ascii="Times New Roman" w:hAnsi="Times New Roman"/>
-          <w:color w:val="000000"/>
-          <w:sz w:val="24"/>
-        </w:rPr>
-        <w:t xml:space="preserve">, 9459–9474.</w:t>
+        <w:t xml:space="preserve">Ley de Protección de Datos Personales</w:t>
+      </w:r>
+      <w:r>
+        <w:rPr>
+          <w:rFonts w:ascii="Times New Roman" w:hAnsi="Times New Roman"/>
+          <w:color w:val="000000"/>
+          <w:sz w:val="24"/>
+        </w:rPr>
+        <w:t xml:space="preserve">. Congreso de la República del Perú.</w:t>
       </w:r>
     </w:p>
     <w:p>
@@ -18203,7 +18203,7 @@
           <w:color w:val="000000"/>
           <w:sz w:val="24"/>
         </w:rPr>
-        <w:t xml:space="preserve">Ley N.º 29733. (2011). </w:t>
+        <w:t xml:space="preserve">Microsoft. (2025a). </w:t>
       </w:r>
       <w:r>
         <w:rPr>
@@ -18213,15 +18213,15 @@
           <w:iCs/>
           <w:sz w:val="24"/>
         </w:rPr>
-        <w:t xml:space="preserve">Ley de Protección de Datos Personales</w:t>
-      </w:r>
-      <w:r>
-        <w:rPr>
-          <w:rFonts w:ascii="Times New Roman" w:hAnsi="Times New Roman"/>
-          <w:color w:val="000000"/>
-          <w:sz w:val="24"/>
-        </w:rPr>
-        <w:t xml:space="preserve">. Congreso de la República del Perú.</w:t>
+        <w:t xml:space="preserve">Microsoft Agent Framework</w:t>
+      </w:r>
+      <w:r>
+        <w:rPr>
+          <w:rFonts w:ascii="Times New Roman" w:hAnsi="Times New Roman"/>
+          <w:color w:val="000000"/>
+          <w:sz w:val="24"/>
+        </w:rPr>
+        <w:t xml:space="preserve"> [Repositorio de código fuente]. GitHub. https://github.com/microsoft/agent-framework</w:t>
       </w:r>
     </w:p>
     <w:p>
@@ -18236,7 +18236,7 @@
           <w:color w:val="000000"/>
           <w:sz w:val="24"/>
         </w:rPr>
-        <w:t xml:space="preserve">Microsoft. (2025a). </w:t>
+        <w:t xml:space="preserve">Microsoft. (2025b). </w:t>
       </w:r>
       <w:r>
         <w:rPr>
@@ -18246,15 +18246,15 @@
           <w:iCs/>
           <w:sz w:val="24"/>
         </w:rPr>
-        <w:t xml:space="preserve">Microsoft Agent Framework</w:t>
-      </w:r>
-      <w:r>
-        <w:rPr>
-          <w:rFonts w:ascii="Times New Roman" w:hAnsi="Times New Roman"/>
-          <w:color w:val="000000"/>
-          <w:sz w:val="24"/>
-        </w:rPr>
-        <w:t xml:space="preserve"> [Repositorio de código fuente]. GitHub. https://github.com/microsoft/agent-framework</w:t>
+        <w:t xml:space="preserve">Phi-4-mini-instruct</w:t>
+      </w:r>
+      <w:r>
+        <w:rPr>
+          <w:rFonts w:ascii="Times New Roman" w:hAnsi="Times New Roman"/>
+          <w:color w:val="000000"/>
+          <w:sz w:val="24"/>
+        </w:rPr>
+        <w:t xml:space="preserve"> [Ficha del modelo]. Hugging Face. https://huggingface.co/microsoft/Phi-4-mini-instruct</w:t>
       </w:r>
     </w:p>
     <w:p>
@@ -18269,7 +18269,7 @@
           <w:color w:val="000000"/>
           <w:sz w:val="24"/>
         </w:rPr>
-        <w:t xml:space="preserve">Microsoft. (2025b). </w:t>
+        <w:t xml:space="preserve">Microsoft. (2025c). </w:t>
       </w:r>
       <w:r>
         <w:rPr>
@@ -18279,15 +18279,15 @@
           <w:iCs/>
           <w:sz w:val="24"/>
         </w:rPr>
-        <w:t xml:space="preserve">Phi-4-mini-instruct</w:t>
-      </w:r>
-      <w:r>
-        <w:rPr>
-          <w:rFonts w:ascii="Times New Roman" w:hAnsi="Times New Roman"/>
-          <w:color w:val="000000"/>
-          <w:sz w:val="24"/>
-        </w:rPr>
-        <w:t xml:space="preserve"> [Ficha del modelo]. Hugging Face. https://huggingface.co/microsoft/Phi-4-mini-instruct</w:t>
+        <w:t xml:space="preserve">What is Foundry Local?</w:t>
+      </w:r>
+      <w:r>
+        <w:rPr>
+          <w:rFonts w:ascii="Times New Roman" w:hAnsi="Times New Roman"/>
+          <w:color w:val="000000"/>
+          <w:sz w:val="24"/>
+        </w:rPr>
+        <w:t xml:space="preserve"> Microsoft Learn. https://learn.microsoft.com/en-us/azure/ai-foundry/foundry-local/what-is-foundry-local</w:t>
       </w:r>
     </w:p>
     <w:p>
@@ -18302,7 +18302,7 @@
           <w:color w:val="000000"/>
           <w:sz w:val="24"/>
         </w:rPr>
-        <w:t xml:space="preserve">Microsoft. (2025c). </w:t>
+        <w:t xml:space="preserve">Microsoft. (2026). </w:t>
       </w:r>
       <w:r>
         <w:rPr>
@@ -18312,15 +18312,15 @@
           <w:iCs/>
           <w:sz w:val="24"/>
         </w:rPr>
-        <w:t xml:space="preserve">What is Foundry Local?</w:t>
-      </w:r>
-      <w:r>
-        <w:rPr>
-          <w:rFonts w:ascii="Times New Roman" w:hAnsi="Times New Roman"/>
-          <w:color w:val="000000"/>
-          <w:sz w:val="24"/>
-        </w:rPr>
-        <w:t xml:space="preserve"> Microsoft Learn. https://learn.microsoft.com/en-us/azure/ai-foundry/foundry-local/what-is-foundry-local</w:t>
+        <w:t xml:space="preserve">Copilot Developer Camp</w:t>
+      </w:r>
+      <w:r>
+        <w:rPr>
+          <w:rFonts w:ascii="Times New Roman" w:hAnsi="Times New Roman"/>
+          <w:color w:val="000000"/>
+          <w:sz w:val="24"/>
+        </w:rPr>
+        <w:t xml:space="preserve">. https://microsoft.github.io/copilot-camp/</w:t>
       </w:r>
     </w:p>
     <w:p>
@@ -18335,7 +18335,7 @@
           <w:color w:val="000000"/>
           <w:sz w:val="24"/>
         </w:rPr>
-        <w:t xml:space="preserve">Microsoft. (2026). </w:t>
+        <w:t xml:space="preserve">Microsoft. (s. f.). </w:t>
       </w:r>
       <w:r>
         <w:rPr>
@@ -18345,15 +18345,15 @@
           <w:iCs/>
           <w:sz w:val="24"/>
         </w:rPr>
-        <w:t xml:space="preserve">Copilot Developer Camp</w:t>
-      </w:r>
-      <w:r>
-        <w:rPr>
-          <w:rFonts w:ascii="Times New Roman" w:hAnsi="Times New Roman"/>
-          <w:color w:val="000000"/>
-          <w:sz w:val="24"/>
-        </w:rPr>
-        <w:t xml:space="preserve">. https://microsoft.github.io/copilot-camp/</w:t>
+        <w:t xml:space="preserve">Knowledge sources overview (Microsoft Copilot Studio)</w:t>
+      </w:r>
+      <w:r>
+        <w:rPr>
+          <w:rFonts w:ascii="Times New Roman" w:hAnsi="Times New Roman"/>
+          <w:color w:val="000000"/>
+          <w:sz w:val="24"/>
+        </w:rPr>
+        <w:t xml:space="preserve">. Microsoft Learn. https://learn.microsoft.com/en-us/microsoft-copilot-studio/knowledge-copilot-studio</w:t>
       </w:r>
     </w:p>
     <w:p>
@@ -18368,7 +18368,7 @@
           <w:color w:val="000000"/>
           <w:sz w:val="24"/>
         </w:rPr>
-        <w:t xml:space="preserve">Microsoft. (s. f.). </w:t>
+        <w:t xml:space="preserve">Manning, C. D., Raghavan, P., y Schütze, H. (2008). </w:t>
       </w:r>
       <w:r>
         <w:rPr>
@@ -18378,15 +18378,15 @@
           <w:iCs/>
           <w:sz w:val="24"/>
         </w:rPr>
-        <w:t xml:space="preserve">Knowledge sources overview (Microsoft Copilot Studio)</w:t>
-      </w:r>
-      <w:r>
-        <w:rPr>
-          <w:rFonts w:ascii="Times New Roman" w:hAnsi="Times New Roman"/>
-          <w:color w:val="000000"/>
-          <w:sz w:val="24"/>
-        </w:rPr>
-        <w:t xml:space="preserve">. Microsoft Learn. https://learn.microsoft.com/en-us/microsoft-copilot-studio/knowledge-copilot-studio</w:t>
+        <w:t xml:space="preserve">Introduction to information retrieval</w:t>
+      </w:r>
+      <w:r>
+        <w:rPr>
+          <w:rFonts w:ascii="Times New Roman" w:hAnsi="Times New Roman"/>
+          <w:color w:val="000000"/>
+          <w:sz w:val="24"/>
+        </w:rPr>
+        <w:t xml:space="preserve">. Cambridge University Press.</w:t>
       </w:r>
     </w:p>
     <w:p>
@@ -18401,7 +18401,7 @@
           <w:color w:val="000000"/>
           <w:sz w:val="24"/>
         </w:rPr>
-        <w:t xml:space="preserve">Manning, C. D., Raghavan, P., y Schütze, H. (2008). </w:t>
+        <w:t xml:space="preserve">Miao, F., y Holmes, W. (2023). </w:t>
       </w:r>
       <w:r>
         <w:rPr>
@@ -18411,15 +18411,15 @@
           <w:iCs/>
           <w:sz w:val="24"/>
         </w:rPr>
-        <w:t xml:space="preserve">Introduction to information retrieval</w:t>
-      </w:r>
-      <w:r>
-        <w:rPr>
-          <w:rFonts w:ascii="Times New Roman" w:hAnsi="Times New Roman"/>
-          <w:color w:val="000000"/>
-          <w:sz w:val="24"/>
-        </w:rPr>
-        <w:t xml:space="preserve">. Cambridge University Press.</w:t>
+        <w:t xml:space="preserve">Guidance for generative AI in education and research</w:t>
+      </w:r>
+      <w:r>
+        <w:rPr>
+          <w:rFonts w:ascii="Times New Roman" w:hAnsi="Times New Roman"/>
+          <w:color w:val="000000"/>
+          <w:sz w:val="24"/>
+        </w:rPr>
+        <w:t xml:space="preserve">. UNESCO. https://hub.teachingandlearning.ie/resource/guidance-for-generative-ai-in-education-and-research/</w:t>
       </w:r>
     </w:p>
     <w:p>
@@ -18434,7 +18434,7 @@
           <w:color w:val="000000"/>
           <w:sz w:val="24"/>
         </w:rPr>
-        <w:t xml:space="preserve">Miao, F., y Holmes, W. (2023). </w:t>
+        <w:t xml:space="preserve">Model Context Protocol. (2025, 18 de junio). </w:t>
       </w:r>
       <w:r>
         <w:rPr>
@@ -18444,15 +18444,15 @@
           <w:iCs/>
           <w:sz w:val="24"/>
         </w:rPr>
-        <w:t xml:space="preserve">Guidance for generative AI in education and research</w:t>
-      </w:r>
-      <w:r>
-        <w:rPr>
-          <w:rFonts w:ascii="Times New Roman" w:hAnsi="Times New Roman"/>
-          <w:color w:val="000000"/>
-          <w:sz w:val="24"/>
-        </w:rPr>
-        <w:t xml:space="preserve">. UNESCO. https://hub.teachingandlearning.ie/resource/guidance-for-generative-ai-in-education-and-research/</w:t>
+        <w:t>Specification (versión 2025-06-18)</w:t>
+      </w:r>
+      <w:r>
+        <w:rPr>
+          <w:rFonts w:ascii="Times New Roman" w:hAnsi="Times New Roman"/>
+          <w:color w:val="000000"/>
+          <w:sz w:val="24"/>
+        </w:rPr>
+        <w:t>. https://modelcontextprotocol.io/specification/2025-06-18</w:t>
       </w:r>
     </w:p>
     <w:p>

</xml_diff>